<commit_message>
Agrega graficos de resultados al informe EFT (desglose latencia, similitud, antes/despues backoff)
Co-Authored-By: FranciscoGomezRa <franc.gomezr@duocuc.cl>
</commit_message>
<xml_diff>
--- a/EFT_final/Informe_EFT_ISY0101.docx
+++ b/EFT_final/Informe_EFT_ISY0101.docx
@@ -1096,6 +1096,110 @@
     </w:p>
     <w:p>
       <w:pPr>
+        <w:jc w:val="center"/>
+      </w:pPr>
+      <w:r>
+        <w:drawing>
+          <wp:inline xmlns:a="http://schemas.openxmlformats.org/drawingml/2006/main" xmlns:pic="http://schemas.openxmlformats.org/drawingml/2006/picture">
+            <wp:extent cx="5040000" cy="2142000"/>
+            <wp:docPr id="3" name="Picture 3"/>
+            <wp:cNvGraphicFramePr>
+              <a:graphicFrameLocks noChangeAspect="1"/>
+            </wp:cNvGraphicFramePr>
+            <a:graphic>
+              <a:graphicData uri="http://schemas.openxmlformats.org/drawingml/2006/picture">
+                <pic:pic>
+                  <pic:nvPicPr>
+                    <pic:cNvPr id="0" name="02_desglose_latencia.png"/>
+                    <pic:cNvPicPr/>
+                  </pic:nvPicPr>
+                  <pic:blipFill>
+                    <a:blip r:embed="rId11"/>
+                    <a:stretch>
+                      <a:fillRect/>
+                    </a:stretch>
+                  </pic:blipFill>
+                  <pic:spPr>
+                    <a:xfrm>
+                      <a:off x="0" y="0"/>
+                      <a:ext cx="5040000" cy="2142000"/>
+                    </a:xfrm>
+                    <a:prstGeom prst="rect"/>
+                  </pic:spPr>
+                </pic:pic>
+              </a:graphicData>
+            </a:graphic>
+          </wp:inline>
+        </w:drawing>
+      </w:r>
+    </w:p>
+    <w:p>
+      <w:pPr>
+        <w:jc w:val="center"/>
+      </w:pPr>
+      <w:r>
+        <w:rPr>
+          <w:i/>
+          <w:color w:val="556573"/>
+          <w:sz w:val="17"/>
+        </w:rPr>
+        <w:t>Figura 2. Desglose de latencia por fase: la generación LLM domina el tiempo.</w:t>
+      </w:r>
+    </w:p>
+    <w:p>
+      <w:pPr>
+        <w:jc w:val="center"/>
+      </w:pPr>
+      <w:r>
+        <w:drawing>
+          <wp:inline xmlns:a="http://schemas.openxmlformats.org/drawingml/2006/main" xmlns:pic="http://schemas.openxmlformats.org/drawingml/2006/picture">
+            <wp:extent cx="5040000" cy="2268000"/>
+            <wp:docPr id="4" name="Picture 4"/>
+            <wp:cNvGraphicFramePr>
+              <a:graphicFrameLocks noChangeAspect="1"/>
+            </wp:cNvGraphicFramePr>
+            <a:graphic>
+              <a:graphicData uri="http://schemas.openxmlformats.org/drawingml/2006/picture">
+                <pic:pic>
+                  <pic:nvPicPr>
+                    <pic:cNvPr id="0" name="05_similitud_categoria.png"/>
+                    <pic:cNvPicPr/>
+                  </pic:nvPicPr>
+                  <pic:blipFill>
+                    <a:blip r:embed="rId12"/>
+                    <a:stretch>
+                      <a:fillRect/>
+                    </a:stretch>
+                  </pic:blipFill>
+                  <pic:spPr>
+                    <a:xfrm>
+                      <a:off x="0" y="0"/>
+                      <a:ext cx="5040000" cy="2268000"/>
+                    </a:xfrm>
+                    <a:prstGeom prst="rect"/>
+                  </pic:spPr>
+                </pic:pic>
+              </a:graphicData>
+            </a:graphic>
+          </wp:inline>
+        </w:drawing>
+      </w:r>
+    </w:p>
+    <w:p>
+      <w:pPr>
+        <w:jc w:val="center"/>
+      </w:pPr>
+      <w:r>
+        <w:rPr>
+          <w:i/>
+          <w:color w:val="556573"/>
+          <w:sz w:val="17"/>
+        </w:rPr>
+        <w:t>Figura 3. Score de similitud por categoría: separación en/fuera de dominio y umbral.</w:t>
+      </w:r>
+    </w:p>
+    <w:p>
+      <w:pPr>
         <w:spacing w:after="80"/>
       </w:pPr>
       <w:r>
@@ -1399,6 +1503,58 @@
         </w:tc>
       </w:tr>
     </w:tbl>
+    <w:p>
+      <w:pPr>
+        <w:jc w:val="center"/>
+      </w:pPr>
+      <w:r>
+        <w:drawing>
+          <wp:inline xmlns:a="http://schemas.openxmlformats.org/drawingml/2006/main" xmlns:pic="http://schemas.openxmlformats.org/drawingml/2006/picture">
+            <wp:extent cx="5400000" cy="2259759"/>
+            <wp:docPr id="5" name="Picture 5"/>
+            <wp:cNvGraphicFramePr>
+              <a:graphicFrameLocks noChangeAspect="1"/>
+            </wp:cNvGraphicFramePr>
+            <a:graphic>
+              <a:graphicData uri="http://schemas.openxmlformats.org/drawingml/2006/picture">
+                <pic:pic>
+                  <pic:nvPicPr>
+                    <pic:cNvPr id="0" name="antes_despues_backoff.png"/>
+                    <pic:cNvPicPr/>
+                  </pic:nvPicPr>
+                  <pic:blipFill>
+                    <a:blip r:embed="rId13"/>
+                    <a:stretch>
+                      <a:fillRect/>
+                    </a:stretch>
+                  </pic:blipFill>
+                  <pic:spPr>
+                    <a:xfrm>
+                      <a:off x="0" y="0"/>
+                      <a:ext cx="5400000" cy="2259759"/>
+                    </a:xfrm>
+                    <a:prstGeom prst="rect"/>
+                  </pic:spPr>
+                </pic:pic>
+              </a:graphicData>
+            </a:graphic>
+          </wp:inline>
+        </w:drawing>
+      </w:r>
+    </w:p>
+    <w:p>
+      <w:pPr>
+        <w:jc w:val="center"/>
+      </w:pPr>
+      <w:r>
+        <w:rPr>
+          <w:i/>
+          <w:color w:val="556573"/>
+          <w:sz w:val="17"/>
+        </w:rPr>
+        <w:t>Figura 4. Efecto del backoff en la tasa de error de API y en las latencias.</w:t>
+      </w:r>
+    </w:p>
     <w:p>
       <w:pPr>
         <w:spacing w:after="80"/>

</xml_diff>